<commit_message>
Revert "Rebrand the institution to Albalagh International Premium College"
This reverts commit 385d57a0233eb1f0358a7268e004b85548a7de43.
</commit_message>
<xml_diff>
--- a/publication/IEFC Flagship Curriculum.docx
+++ b/publication/IEFC Flagship Curriculum.docx
@@ -70,7 +70,7 @@
           <w:sz w:val="18"/>
           <w:szCs w:val="18"/>
         </w:rPr>
-        <w:t xml:space="preserve">Albalagh International Premium College</w:t>
+        <w:t xml:space="preserve">Worldwide English College</w:t>
       </w:r>
     </w:p>
     <w:p>
@@ -217,7 +217,7 @@
           <w:sz w:val="15"/>
           <w:szCs w:val="15"/>
         </w:rPr>
-        <w:t xml:space="preserve">Albalagh International Premium College Press</w:t>
+        <w:t xml:space="preserve">Worldwide English College Press</w:t>
       </w:r>
     </w:p>
     <w:p>
@@ -310,7 +310,7 @@
           <w:sz w:val="21"/>
           <w:szCs w:val="21"/>
         </w:rPr>
-        <w:t xml:space="preserve">Published by Albalagh International Premium College Press, London Campus.</w:t>
+        <w:t xml:space="preserve">Published by Worldwide English College Press, London Campus.</w:t>
       </w:r>
     </w:p>
     <w:p>
@@ -324,7 +324,7 @@
           <w:sz w:val="21"/>
           <w:szCs w:val="21"/>
         </w:rPr>
-        <w:t xml:space="preserve">© Albalagh International Premium College. All rights reserved.</w:t>
+        <w:t xml:space="preserve">© Worldwide English College. All rights reserved.</w:t>
       </w:r>
     </w:p>
     <w:p>
@@ -778,7 +778,7 @@
           <w:sz w:val="32"/>
           <w:szCs w:val="32"/>
         </w:rPr>
-        <w:t xml:space="preserve">About Albalagh International Premium College</w:t>
+        <w:t xml:space="preserve">About Worldwide English College</w:t>
       </w:r>
     </w:p>
     <w:p>
@@ -803,7 +803,7 @@
           <w:sz w:val="23"/>
           <w:szCs w:val="23"/>
         </w:rPr>
-        <w:t xml:space="preserve">Albalagh International Premium College, London Campus, is an online institution teaching English as an international language. It confers its own awards, maintains its own Graduate Register, and publishes the architecture of its qualification so that the awards can be read and checked by people who have never met the College.</w:t>
+        <w:t xml:space="preserve">Worldwide English College, London Campus, is an online institution teaching English as an international language. It confers its own awards, maintains its own Graduate Register, and publishes the architecture of its qualification so that the awards can be read and checked by people who have never met the College.</w:t>
       </w:r>
     </w:p>
     <w:p>
@@ -1130,7 +1130,7 @@
                 <w:sz w:val="18"/>
                 <w:szCs w:val="18"/>
               </w:rPr>
-              <w:t xml:space="preserve">3 members appointed</w:t>
+              <w:t xml:space="preserve">Established; not yet constituted</w:t>
             </w:r>
           </w:p>
         </w:tc>
@@ -2288,7 +2288,7 @@
           <w:sz w:val="21"/>
           <w:szCs w:val="21"/>
         </w:rPr>
-        <w:t xml:space="preserve">Sixty assignments, one per module, each marked by a person against a published rubric normalised to the AIPC rubric policy — not auto-scored. Spoken work is captured as learner recordings and reviewed in the instructor workspace.</w:t>
+        <w:t xml:space="preserve">Sixty assignments, one per module, each marked by a person against a published rubric normalised to the WEC-LC rubric policy — not auto-scored. Spoken work is captured as learner recordings and reviewed in the instructor workspace.</w:t>
       </w:r>
     </w:p>
     <w:p>
@@ -2459,7 +2459,7 @@
           <w:sz w:val="23"/>
           <w:szCs w:val="23"/>
         </w:rPr>
-        <w:t xml:space="preserve">The IEFC is a six-level ascent, mapped to the Common European Framework of Reference from A1 to C2. Each level confers its own award, and each award is complete in itself: a learner who stops at Level III has not failed to become something. They are an English Associate of Albalagh International Premium College, permanently, and the College says so in those words.</w:t>
+        <w:t xml:space="preserve">The IEFC is a six-level ascent, mapped to the Common European Framework of Reference from A1 to C2. Each level confers its own award, and each award is complete in itself: a learner who stops at Level III has not failed to become something. They are an English Associate of Worldwide English College, permanently, and the College says so in those words.</w:t>
       </w:r>
     </w:p>
     <w:p>
@@ -2700,7 +2700,7 @@
                 <w:sz w:val="18"/>
                 <w:szCs w:val="18"/>
               </w:rPr>
-              <w:t xml:space="preserve">English Aspirant of Albalagh International Premium College</w:t>
+              <w:t xml:space="preserve">English Aspirant of Worldwide English College</w:t>
             </w:r>
           </w:p>
         </w:tc>
@@ -2728,7 +2728,7 @@
                 <w:sz w:val="18"/>
                 <w:szCs w:val="18"/>
               </w:rPr>
-              <w:t xml:space="preserve">ApAIPC</w:t>
+              <w:t xml:space="preserve">ApWEC</w:t>
             </w:r>
           </w:p>
         </w:tc>
@@ -2814,7 +2814,7 @@
                 <w:sz w:val="18"/>
                 <w:szCs w:val="18"/>
               </w:rPr>
-              <w:t xml:space="preserve">English Candidate of Albalagh International Premium College</w:t>
+              <w:t xml:space="preserve">English Candidate of Worldwide English College</w:t>
             </w:r>
           </w:p>
         </w:tc>
@@ -2842,7 +2842,7 @@
                 <w:sz w:val="18"/>
                 <w:szCs w:val="18"/>
               </w:rPr>
-              <w:t xml:space="preserve">CnAIPC</w:t>
+              <w:t xml:space="preserve">CnWEC</w:t>
             </w:r>
           </w:p>
         </w:tc>
@@ -2928,7 +2928,7 @@
                 <w:sz w:val="18"/>
                 <w:szCs w:val="18"/>
               </w:rPr>
-              <w:t xml:space="preserve">English Associate of Albalagh International Premium College</w:t>
+              <w:t xml:space="preserve">English Associate of Worldwide English College</w:t>
             </w:r>
           </w:p>
         </w:tc>
@@ -2956,7 +2956,7 @@
                 <w:sz w:val="18"/>
                 <w:szCs w:val="18"/>
               </w:rPr>
-              <w:t xml:space="preserve">AsAIPC</w:t>
+              <w:t xml:space="preserve">AsWEC</w:t>
             </w:r>
           </w:p>
         </w:tc>
@@ -3042,7 +3042,7 @@
                 <w:sz w:val="18"/>
                 <w:szCs w:val="18"/>
               </w:rPr>
-              <w:t xml:space="preserve">English Envoy of Albalagh International Premium College</w:t>
+              <w:t xml:space="preserve">English Envoy of Worldwide English College</w:t>
             </w:r>
           </w:p>
         </w:tc>
@@ -3070,7 +3070,7 @@
                 <w:sz w:val="18"/>
                 <w:szCs w:val="18"/>
               </w:rPr>
-              <w:t xml:space="preserve">EnAIPC</w:t>
+              <w:t xml:space="preserve">EnWEC</w:t>
             </w:r>
           </w:p>
         </w:tc>
@@ -3156,7 +3156,7 @@
                 <w:sz w:val="18"/>
                 <w:szCs w:val="18"/>
               </w:rPr>
-              <w:t xml:space="preserve">English Orator of Albalagh International Premium College</w:t>
+              <w:t xml:space="preserve">English Orator of Worldwide English College</w:t>
             </w:r>
           </w:p>
         </w:tc>
@@ -3184,7 +3184,7 @@
                 <w:sz w:val="18"/>
                 <w:szCs w:val="18"/>
               </w:rPr>
-              <w:t xml:space="preserve">OrAIPC</w:t>
+              <w:t xml:space="preserve">OrWEC</w:t>
             </w:r>
           </w:p>
         </w:tc>
@@ -3270,7 +3270,7 @@
                 <w:sz w:val="18"/>
                 <w:szCs w:val="18"/>
               </w:rPr>
-              <w:t xml:space="preserve">English Laureate of Albalagh International Premium College</w:t>
+              <w:t xml:space="preserve">English Laureate of Worldwide English College</w:t>
             </w:r>
           </w:p>
         </w:tc>
@@ -3298,7 +3298,7 @@
                 <w:sz w:val="18"/>
                 <w:szCs w:val="18"/>
               </w:rPr>
-              <w:t xml:space="preserve">LrAIPC</w:t>
+              <w:t xml:space="preserve">LrWEC</w:t>
             </w:r>
           </w:p>
         </w:tc>
@@ -3441,7 +3441,7 @@
                 <w:sz w:val="18"/>
                 <w:szCs w:val="18"/>
               </w:rPr>
-              <w:t xml:space="preserve">ApAIPC</w:t>
+              <w:t xml:space="preserve">ApWEC</w:t>
             </w:r>
           </w:p>
         </w:tc>
@@ -3499,7 +3499,7 @@
                 <w:sz w:val="18"/>
                 <w:szCs w:val="18"/>
               </w:rPr>
-              <w:t xml:space="preserve">CnAIPC</w:t>
+              <w:t xml:space="preserve">CnWEC</w:t>
             </w:r>
           </w:p>
         </w:tc>
@@ -3557,7 +3557,7 @@
                 <w:sz w:val="18"/>
                 <w:szCs w:val="18"/>
               </w:rPr>
-              <w:t xml:space="preserve">AsAIPC</w:t>
+              <w:t xml:space="preserve">AsWEC</w:t>
             </w:r>
           </w:p>
         </w:tc>
@@ -3615,7 +3615,7 @@
                 <w:sz w:val="18"/>
                 <w:szCs w:val="18"/>
               </w:rPr>
-              <w:t xml:space="preserve">EnAIPC</w:t>
+              <w:t xml:space="preserve">EnWEC</w:t>
             </w:r>
           </w:p>
         </w:tc>
@@ -3673,7 +3673,7 @@
                 <w:sz w:val="18"/>
                 <w:szCs w:val="18"/>
               </w:rPr>
-              <w:t xml:space="preserve">OrAIPC</w:t>
+              <w:t xml:space="preserve">OrWEC</w:t>
             </w:r>
           </w:p>
         </w:tc>
@@ -3731,7 +3731,7 @@
                 <w:sz w:val="18"/>
                 <w:szCs w:val="18"/>
               </w:rPr>
-              <w:t xml:space="preserve">LrAIPC</w:t>
+              <w:t xml:space="preserve">LrWEC</w:t>
             </w:r>
           </w:p>
         </w:tc>
@@ -6576,7 +6576,7 @@
           <w:sz w:val="21"/>
           <w:szCs w:val="21"/>
         </w:rPr>
-        <w:t xml:space="preserve">English Aspirant of Albalagh International Premium College  ·  ApAIPC  ·  CEFR A1</w:t>
+        <w:t xml:space="preserve">English Aspirant of Worldwide English College  ·  ApWEC  ·  CEFR A1</w:t>
       </w:r>
     </w:p>
     <w:p>
@@ -6717,7 +6717,7 @@
           <w:sz w:val="21"/>
           <w:szCs w:val="21"/>
         </w:rPr>
-        <w:t xml:space="preserve">English Aspirant of Albalagh International Premium College (ApAIPC). Entry into the tradition.</w:t>
+        <w:t xml:space="preserve">English Aspirant of Worldwide English College (ApWEC). Entry into the tradition.</w:t>
       </w:r>
     </w:p>
     <w:p>
@@ -7919,7 +7919,7 @@
           <w:sz w:val="21"/>
           <w:szCs w:val="21"/>
         </w:rPr>
-        <w:t xml:space="preserve">English Candidate of Albalagh International Premium College  ·  CnAIPC  ·  CEFR A2</w:t>
+        <w:t xml:space="preserve">English Candidate of Worldwide English College  ·  CnWEC  ·  CEFR A2</w:t>
       </w:r>
     </w:p>
     <w:p>
@@ -8060,7 +8060,7 @@
           <w:sz w:val="21"/>
           <w:szCs w:val="21"/>
         </w:rPr>
-        <w:t xml:space="preserve">English Candidate of Albalagh International Premium College (CnAIPC). Recognised learner of the College.</w:t>
+        <w:t xml:space="preserve">English Candidate of Worldwide English College (CnWEC). Recognised learner of the College.</w:t>
       </w:r>
     </w:p>
     <w:p>
@@ -9262,7 +9262,7 @@
           <w:sz w:val="21"/>
           <w:szCs w:val="21"/>
         </w:rPr>
-        <w:t xml:space="preserve">English Associate of Albalagh International Premium College  ·  AsAIPC  ·  CEFR B1</w:t>
+        <w:t xml:space="preserve">English Associate of Worldwide English College  ·  AsWEC  ·  CEFR B1</w:t>
       </w:r>
     </w:p>
     <w:p>
@@ -9403,7 +9403,7 @@
           <w:sz w:val="21"/>
           <w:szCs w:val="21"/>
         </w:rPr>
-        <w:t xml:space="preserve">English Associate of Albalagh International Premium College (AsAIPC). Established member of the academic community.</w:t>
+        <w:t xml:space="preserve">English Associate of Worldwide English College (AsWEC). Established member of the academic community.</w:t>
       </w:r>
     </w:p>
     <w:p>
@@ -10605,7 +10605,7 @@
           <w:sz w:val="21"/>
           <w:szCs w:val="21"/>
         </w:rPr>
-        <w:t xml:space="preserve">English Envoy of Albalagh International Premium College  ·  EnAIPC  ·  CEFR B2</w:t>
+        <w:t xml:space="preserve">English Envoy of Worldwide English College  ·  EnWEC  ·  CEFR B2</w:t>
       </w:r>
     </w:p>
     <w:p>
@@ -10746,7 +10746,7 @@
           <w:sz w:val="21"/>
           <w:szCs w:val="21"/>
         </w:rPr>
-        <w:t xml:space="preserve">English Envoy of Albalagh International Premium College (EnAIPC). Trusted representative and communicator.</w:t>
+        <w:t xml:space="preserve">English Envoy of Worldwide English College (EnWEC). Trusted representative and communicator.</w:t>
       </w:r>
     </w:p>
     <w:p>
@@ -11948,7 +11948,7 @@
           <w:sz w:val="21"/>
           <w:szCs w:val="21"/>
         </w:rPr>
-        <w:t xml:space="preserve">English Orator of Albalagh International Premium College  ·  OrAIPC  ·  CEFR C1</w:t>
+        <w:t xml:space="preserve">English Orator of Worldwide English College  ·  OrWEC  ·  CEFR C1</w:t>
       </w:r>
     </w:p>
     <w:p>
@@ -12089,7 +12089,7 @@
           <w:sz w:val="21"/>
           <w:szCs w:val="21"/>
         </w:rPr>
-        <w:t xml:space="preserve">English Orator of Albalagh International Premium College (OrAIPC). High-level intellectual and professional communicator.</w:t>
+        <w:t xml:space="preserve">English Orator of Worldwide English College (OrWEC). High-level intellectual and professional communicator.</w:t>
       </w:r>
     </w:p>
     <w:p>
@@ -13291,7 +13291,7 @@
           <w:sz w:val="21"/>
           <w:szCs w:val="21"/>
         </w:rPr>
-        <w:t xml:space="preserve">English Laureate of Albalagh International Premium College  ·  LrAIPC  ·  CEFR C2</w:t>
+        <w:t xml:space="preserve">English Laureate of Worldwide English College  ·  LrWEC  ·  CEFR C2</w:t>
       </w:r>
     </w:p>
     <w:p>
@@ -13432,7 +13432,7 @@
           <w:sz w:val="21"/>
           <w:szCs w:val="21"/>
         </w:rPr>
-        <w:t xml:space="preserve">English Laureate of Albalagh International Premium College (LrAIPC). Distinguished master of the programme.</w:t>
+        <w:t xml:space="preserve">English Laureate of Worldwide English College (LrWEC). Distinguished master of the programme.</w:t>
       </w:r>
     </w:p>
     <w:p>
@@ -14643,7 +14643,7 @@
           <w:sz w:val="23"/>
           <w:szCs w:val="23"/>
         </w:rPr>
-        <w:t xml:space="preserve">Every graduate belongs to the Albalagh International Premium College Alumni Society, and within it to the chapter of their highest award. Membership is not applied for and is not recorded separately: it follows from the award, and it moves when the award does.</w:t>
+        <w:t xml:space="preserve">Every graduate belongs to the Worldwide English College Alumni Society, and within it to the chapter of their highest award. Membership is not applied for and is not recorded separately: it follows from the award, and it moves when the award does.</w:t>
       </w:r>
     </w:p>
     <w:tbl>
@@ -14811,7 +14811,7 @@
                 <w:sz w:val="18"/>
                 <w:szCs w:val="18"/>
               </w:rPr>
-              <w:t xml:space="preserve">ApAIPC</w:t>
+              <w:t xml:space="preserve">ApWEC</w:t>
             </w:r>
           </w:p>
         </w:tc>
@@ -14897,7 +14897,7 @@
                 <w:sz w:val="18"/>
                 <w:szCs w:val="18"/>
               </w:rPr>
-              <w:t xml:space="preserve">CnAIPC</w:t>
+              <w:t xml:space="preserve">CnWEC</w:t>
             </w:r>
           </w:p>
         </w:tc>
@@ -14983,7 +14983,7 @@
                 <w:sz w:val="18"/>
                 <w:szCs w:val="18"/>
               </w:rPr>
-              <w:t xml:space="preserve">AsAIPC</w:t>
+              <w:t xml:space="preserve">AsWEC</w:t>
             </w:r>
           </w:p>
         </w:tc>
@@ -15069,7 +15069,7 @@
                 <w:sz w:val="18"/>
                 <w:szCs w:val="18"/>
               </w:rPr>
-              <w:t xml:space="preserve">EnAIPC</w:t>
+              <w:t xml:space="preserve">EnWEC</w:t>
             </w:r>
           </w:p>
         </w:tc>
@@ -15155,7 +15155,7 @@
                 <w:sz w:val="18"/>
                 <w:szCs w:val="18"/>
               </w:rPr>
-              <w:t xml:space="preserve">OrAIPC</w:t>
+              <w:t xml:space="preserve">OrWEC</w:t>
             </w:r>
           </w:p>
         </w:tc>
@@ -15241,7 +15241,7 @@
                 <w:sz w:val="18"/>
                 <w:szCs w:val="18"/>
               </w:rPr>
-              <w:t xml:space="preserve">LrAIPC</w:t>
+              <w:t xml:space="preserve">LrWEC</w:t>
             </w:r>
           </w:p>
         </w:tc>
@@ -15554,7 +15554,7 @@
                 <w:sz w:val="18"/>
                 <w:szCs w:val="18"/>
               </w:rPr>
-              <w:t xml:space="preserve">AIPC Credit</w:t>
+              <w:t xml:space="preserve">WEC Credit</w:t>
             </w:r>
           </w:p>
         </w:tc>
@@ -16148,7 +16148,7 @@
           <w:sz w:val="16"/>
           <w:szCs w:val="16"/>
         </w:rPr>
-        <w:t xml:space="preserve">Albalagh International Premium College Press · London Campus</w:t>
+        <w:t xml:space="preserve">Worldwide English College Press · London Campus</w:t>
       </w:r>
     </w:p>
     <w:sectPr>

</xml_diff>

<commit_message>
Regenerate publication masters and library registry from current source
The checked-in IEFC Flagship Curriculum docx/pdf were last rendered
before commit 71a0d601 corrected the College's identity in
scripts/publication/blocks.mjs (comma phrasing to the em-dash form) —
publication.test.mjs's own token-for-token editable/print parity check
was failing against them. Also regenerates the Complete Curriculum,
Cover Artwork, Production Specifications and Internal Editorial Bible
PDFs, the Level I Teacher's Companion, and the library byte registry, so
every publication artifact reflects current source content rather than
a stale snapshot.

Co-Authored-By: Claude Sonnet 5 <noreply@anthropic.com>
Claude-Session: https://claude.ai/code/session_012K4giVM7A2piq8Jq51pSTT
</commit_message>
<xml_diff>
--- a/publication/IEFC Flagship Curriculum.docx
+++ b/publication/IEFC Flagship Curriculum.docx
@@ -1292,7 +1292,7 @@
           <w:sz w:val="23"/>
           <w:szCs w:val="23"/>
         </w:rPr>
-        <w:t xml:space="preserve">Worldwide English College, London Campus, is an online institution teaching English as an international language. It confers its own awards, maintains its own Graduate Register, and publishes the architecture of its qualification so that the awards can be read and checked by people who have never met the College.</w:t>
+        <w:t xml:space="preserve">Worldwide English College — London Campus, is an online institution teaching English as an international language. It confers its own awards, maintains its own Graduate Register, and publishes the architecture of its qualification so that the awards can be read and checked by people who have never met the College.</w:t>
       </w:r>
     </w:p>
     <w:p>
@@ -2777,7 +2777,7 @@
           <w:sz w:val="21"/>
           <w:szCs w:val="21"/>
         </w:rPr>
-        <w:t xml:space="preserve">Sixty assignments, one per module, each marked by a person against a published rubric normalised to the WEC-LC rubric policy — not auto-scored. Spoken work is captured as learner recordings and reviewed in the instructor workspace.</w:t>
+        <w:t xml:space="preserve">Sixty assignments, one per module, each marked by a person against a published rubric normalised to the WEC rubric policy — not auto-scored. Spoken work is captured as learner recordings and reviewed in the instructor workspace.</w:t>
       </w:r>
     </w:p>
     <w:p>

</xml_diff>

<commit_message>
Regenerate the Flagship Curriculum and Level I Teacher's Companion, and trim four publication descriptions
Both volumes now render with the corrected "WorldWide" casing
throughout. data/library.json's recorded byte counts are re-measured
against the regenerated files. Six library descriptions (five English,
one Arabic) that exceeded the 160-character search-result limit are
trimmed to fit without losing their voice.

Co-Authored-By: Claude Sonnet 5 <noreply@anthropic.com>
Claude-Session: https://claude.ai/code/session_012K4giVM7A2piq8Jq51pSTT
</commit_message>
<xml_diff>
--- a/publication/IEFC Flagship Curriculum.docx
+++ b/publication/IEFC Flagship Curriculum.docx
@@ -70,7 +70,7 @@
           <w:sz w:val="18"/>
           <w:szCs w:val="18"/>
         </w:rPr>
-        <w:t xml:space="preserve">Worldwide English College</w:t>
+        <w:t xml:space="preserve">WorldWide English College</w:t>
       </w:r>
     </w:p>
     <w:p>
@@ -217,7 +217,7 @@
           <w:sz w:val="15"/>
           <w:szCs w:val="15"/>
         </w:rPr>
-        <w:t xml:space="preserve">Worldwide English College Press</w:t>
+        <w:t xml:space="preserve">WorldWide English College Press</w:t>
       </w:r>
     </w:p>
     <w:p>
@@ -310,7 +310,7 @@
           <w:sz w:val="21"/>
           <w:szCs w:val="21"/>
         </w:rPr>
-        <w:t xml:space="preserve">Published by Worldwide English College Press, London Campus.</w:t>
+        <w:t xml:space="preserve">Published by WorldWide English College Press, London Campus.</w:t>
       </w:r>
     </w:p>
     <w:p>
@@ -324,7 +324,7 @@
           <w:sz w:val="21"/>
           <w:szCs w:val="21"/>
         </w:rPr>
-        <w:t xml:space="preserve">© Worldwide English College. All rights reserved except as granted on the Rights and Permissions page that follows.</w:t>
+        <w:t xml:space="preserve">© WorldWide English College. All rights reserved except as granted on the Rights and Permissions page that follows.</w:t>
       </w:r>
     </w:p>
     <w:p>
@@ -842,7 +842,7 @@
                 <w:sz w:val="20"/>
                 <w:szCs w:val="20"/>
               </w:rPr>
-              <w:t xml:space="preserve">Permission for any reserved use is given in writing, and is usually given. Write to rights@worldwideenglishcollege.com with the volume, the use and the institution. A school that asks is a colleague; the College has no interest in refusing a teacher who wants to do the work properly.</w:t>
+              <w:t xml:space="preserve">Permission for any reserved use is given in writing, and is usually given. Write to info@worldwencollege.co.uk with the volume, the use and the institution. A school that asks is a colleague; the College has no interest in refusing a teacher who wants to do the work properly.</w:t>
             </w:r>
           </w:p>
         </w:tc>
@@ -937,7 +937,7 @@
           <w:sz w:val="16"/>
           <w:szCs w:val="16"/>
         </w:rPr>
-        <w:t xml:space="preserve">The International English Fluency Certificate · First edition, 2026. Published by Worldwide English College Press, London Campus. © 2026 Worldwide English College. All rights reserved except as granted above. Edition mark WEC-LC·AHDC-FGQP.</w:t>
+        <w:t xml:space="preserve">The International English Fluency Certificate · First edition, 2026. Published by WorldWide English College Press, London Campus. © 2026 WorldWide English College. All rights reserved except as granted above. Edition mark WEC-LC·AHDC-FGQP.</w:t>
       </w:r>
     </w:p>
     <w:p>
@@ -1267,7 +1267,7 @@
           <w:sz w:val="32"/>
           <w:szCs w:val="32"/>
         </w:rPr>
-        <w:t xml:space="preserve">About Worldwide English College</w:t>
+        <w:t xml:space="preserve">About WorldWide English College</w:t>
       </w:r>
     </w:p>
     <w:p>
@@ -1292,7 +1292,7 @@
           <w:sz w:val="23"/>
           <w:szCs w:val="23"/>
         </w:rPr>
-        <w:t xml:space="preserve">Worldwide English College — London Campus, is an online institution teaching English as an international language. It confers its own awards, maintains its own Graduate Register, and publishes the architecture of its qualification so that the awards can be read and checked by people who have never met the College.</w:t>
+        <w:t xml:space="preserve">WorldWide English College — London Campus, is an online institution teaching English as an international language. It confers its own awards, maintains its own Graduate Register, and publishes the architecture of its qualification so that the awards can be read and checked by people who have never met the College.</w:t>
       </w:r>
     </w:p>
     <w:p>
@@ -2948,7 +2948,7 @@
           <w:sz w:val="23"/>
           <w:szCs w:val="23"/>
         </w:rPr>
-        <w:t xml:space="preserve">The IEFC is a six-level ascent, mapped to the Common European Framework of Reference from A1 to C2. Each level confers its own award, and each award is complete in itself: a learner who stops at Level III has not failed to become something. They are an English Associate of Worldwide English College, permanently, and the College says so in those words.</w:t>
+        <w:t xml:space="preserve">The IEFC is a six-level ascent, mapped to the Common European Framework of Reference from A1 to C2. Each level confers its own award, and each award is complete in itself: a learner who stops at Level III has not failed to become something. They are an English Associate of WorldWide English College, permanently, and the College says so in those words.</w:t>
       </w:r>
     </w:p>
     <w:p>
@@ -3189,7 +3189,7 @@
                 <w:sz w:val="18"/>
                 <w:szCs w:val="18"/>
               </w:rPr>
-              <w:t xml:space="preserve">English Aspirant of Worldwide English College</w:t>
+              <w:t xml:space="preserve">English Aspirant of WorldWide English College</w:t>
             </w:r>
           </w:p>
         </w:tc>
@@ -3303,7 +3303,7 @@
                 <w:sz w:val="18"/>
                 <w:szCs w:val="18"/>
               </w:rPr>
-              <w:t xml:space="preserve">English Candidate of Worldwide English College</w:t>
+              <w:t xml:space="preserve">English Candidate of WorldWide English College</w:t>
             </w:r>
           </w:p>
         </w:tc>
@@ -3417,7 +3417,7 @@
                 <w:sz w:val="18"/>
                 <w:szCs w:val="18"/>
               </w:rPr>
-              <w:t xml:space="preserve">English Associate of Worldwide English College</w:t>
+              <w:t xml:space="preserve">English Associate of WorldWide English College</w:t>
             </w:r>
           </w:p>
         </w:tc>
@@ -3531,7 +3531,7 @@
                 <w:sz w:val="18"/>
                 <w:szCs w:val="18"/>
               </w:rPr>
-              <w:t xml:space="preserve">English Envoy of Worldwide English College</w:t>
+              <w:t xml:space="preserve">English Envoy of WorldWide English College</w:t>
             </w:r>
           </w:p>
         </w:tc>
@@ -3645,7 +3645,7 @@
                 <w:sz w:val="18"/>
                 <w:szCs w:val="18"/>
               </w:rPr>
-              <w:t xml:space="preserve">English Orator of Worldwide English College</w:t>
+              <w:t xml:space="preserve">English Orator of WorldWide English College</w:t>
             </w:r>
           </w:p>
         </w:tc>
@@ -3759,7 +3759,7 @@
                 <w:sz w:val="18"/>
                 <w:szCs w:val="18"/>
               </w:rPr>
-              <w:t xml:space="preserve">English Laureate of Worldwide English College</w:t>
+              <w:t xml:space="preserve">English Laureate of WorldWide English College</w:t>
             </w:r>
           </w:p>
         </w:tc>
@@ -7065,7 +7065,7 @@
           <w:sz w:val="21"/>
           <w:szCs w:val="21"/>
         </w:rPr>
-        <w:t xml:space="preserve">English Aspirant of Worldwide English College  ·  ApWEC  ·  CEFR A1</w:t>
+        <w:t xml:space="preserve">English Aspirant of WorldWide English College  ·  ApWEC  ·  CEFR A1</w:t>
       </w:r>
     </w:p>
     <w:p>
@@ -7206,7 +7206,7 @@
           <w:sz w:val="21"/>
           <w:szCs w:val="21"/>
         </w:rPr>
-        <w:t xml:space="preserve">English Aspirant of Worldwide English College (ApWEC). Entry into the tradition.</w:t>
+        <w:t xml:space="preserve">English Aspirant of WorldWide English College (ApWEC). Entry into the tradition.</w:t>
       </w:r>
     </w:p>
     <w:p>
@@ -8408,7 +8408,7 @@
           <w:sz w:val="21"/>
           <w:szCs w:val="21"/>
         </w:rPr>
-        <w:t xml:space="preserve">English Candidate of Worldwide English College  ·  CnWEC  ·  CEFR A2</w:t>
+        <w:t xml:space="preserve">English Candidate of WorldWide English College  ·  CnWEC  ·  CEFR A2</w:t>
       </w:r>
     </w:p>
     <w:p>
@@ -8549,7 +8549,7 @@
           <w:sz w:val="21"/>
           <w:szCs w:val="21"/>
         </w:rPr>
-        <w:t xml:space="preserve">English Candidate of Worldwide English College (CnWEC). Recognised learner of the College.</w:t>
+        <w:t xml:space="preserve">English Candidate of WorldWide English College (CnWEC). Recognised learner of the College.</w:t>
       </w:r>
     </w:p>
     <w:p>
@@ -9751,7 +9751,7 @@
           <w:sz w:val="21"/>
           <w:szCs w:val="21"/>
         </w:rPr>
-        <w:t xml:space="preserve">English Associate of Worldwide English College  ·  AsWEC  ·  CEFR B1</w:t>
+        <w:t xml:space="preserve">English Associate of WorldWide English College  ·  AsWEC  ·  CEFR B1</w:t>
       </w:r>
     </w:p>
     <w:p>
@@ -9892,7 +9892,7 @@
           <w:sz w:val="21"/>
           <w:szCs w:val="21"/>
         </w:rPr>
-        <w:t xml:space="preserve">English Associate of Worldwide English College (AsWEC). Established member of the academic community.</w:t>
+        <w:t xml:space="preserve">English Associate of WorldWide English College (AsWEC). Established member of the academic community.</w:t>
       </w:r>
     </w:p>
     <w:p>
@@ -11094,7 +11094,7 @@
           <w:sz w:val="21"/>
           <w:szCs w:val="21"/>
         </w:rPr>
-        <w:t xml:space="preserve">English Envoy of Worldwide English College  ·  EnWEC  ·  CEFR B2</w:t>
+        <w:t xml:space="preserve">English Envoy of WorldWide English College  ·  EnWEC  ·  CEFR B2</w:t>
       </w:r>
     </w:p>
     <w:p>
@@ -11235,7 +11235,7 @@
           <w:sz w:val="21"/>
           <w:szCs w:val="21"/>
         </w:rPr>
-        <w:t xml:space="preserve">English Envoy of Worldwide English College (EnWEC). Trusted representative and communicator.</w:t>
+        <w:t xml:space="preserve">English Envoy of WorldWide English College (EnWEC). Trusted representative and communicator.</w:t>
       </w:r>
     </w:p>
     <w:p>
@@ -12437,7 +12437,7 @@
           <w:sz w:val="21"/>
           <w:szCs w:val="21"/>
         </w:rPr>
-        <w:t xml:space="preserve">English Orator of Worldwide English College  ·  OrWEC  ·  CEFR C1</w:t>
+        <w:t xml:space="preserve">English Orator of WorldWide English College  ·  OrWEC  ·  CEFR C1</w:t>
       </w:r>
     </w:p>
     <w:p>
@@ -12578,7 +12578,7 @@
           <w:sz w:val="21"/>
           <w:szCs w:val="21"/>
         </w:rPr>
-        <w:t xml:space="preserve">English Orator of Worldwide English College (OrWEC). High-level intellectual and professional communicator.</w:t>
+        <w:t xml:space="preserve">English Orator of WorldWide English College (OrWEC). High-level intellectual and professional communicator.</w:t>
       </w:r>
     </w:p>
     <w:p>
@@ -13780,7 +13780,7 @@
           <w:sz w:val="21"/>
           <w:szCs w:val="21"/>
         </w:rPr>
-        <w:t xml:space="preserve">English Laureate of Worldwide English College  ·  LrWEC  ·  CEFR C2</w:t>
+        <w:t xml:space="preserve">English Laureate of WorldWide English College  ·  LrWEC  ·  CEFR C2</w:t>
       </w:r>
     </w:p>
     <w:p>
@@ -13921,7 +13921,7 @@
           <w:sz w:val="21"/>
           <w:szCs w:val="21"/>
         </w:rPr>
-        <w:t xml:space="preserve">English Laureate of Worldwide English College (LrWEC). Distinguished master of the programme.</w:t>
+        <w:t xml:space="preserve">English Laureate of WorldWide English College (LrWEC). Distinguished master of the programme.</w:t>
       </w:r>
     </w:p>
     <w:p>
@@ -15132,7 +15132,7 @@
           <w:sz w:val="23"/>
           <w:szCs w:val="23"/>
         </w:rPr>
-        <w:t xml:space="preserve">Every graduate belongs to the Worldwide English College Alumni Society, and within it to the chapter of their highest award. Membership is not applied for and is not recorded separately: it follows from the award, and it moves when the award does.</w:t>
+        <w:t xml:space="preserve">Every graduate belongs to the WorldWide English College Alumni Society, and within it to the chapter of their highest award. Membership is not applied for and is not recorded separately: it follows from the award, and it moves when the award does.</w:t>
       </w:r>
     </w:p>
     <w:tbl>
@@ -16637,7 +16637,7 @@
           <w:sz w:val="16"/>
           <w:szCs w:val="16"/>
         </w:rPr>
-        <w:t xml:space="preserve">Worldwide English College Press · London Campus</w:t>
+        <w:t xml:space="preserve">WorldWide English College Press · London Campus</w:t>
       </w:r>
     </w:p>
     <w:sectPr>
@@ -16708,7 +16708,7 @@
         <w:sz w:val="13"/>
         <w:szCs w:val="13"/>
       </w:rPr>
-      <w:t xml:space="preserve">The International English Fluency Certificate  ·  © Worldwide English College	</w:t>
+      <w:t xml:space="preserve">The International English Fluency Certificate  ·  © WorldWide English College	</w:t>
     </w:r>
     <w:r>
       <w:rPr>

</xml_diff>